<commit_message>
new meeting minutes for today
</commit_message>
<xml_diff>
--- a/Organizational/meeting minutes/meeting minutes.docx
+++ b/Organizational/meeting minutes/meeting minutes.docx
@@ -62,13 +62,13 @@
           <w:r>
             <w:fldChar w:fldCharType="separate"/>
           </w:r>
-          <w:hyperlink w:anchor="_Toc222493950" w:history="1">
+          <w:hyperlink w:anchor="_Toc223700993" w:history="1">
             <w:r>
               <w:rPr>
                 <w:rStyle w:val="Hyperlink"/>
                 <w:noProof/>
               </w:rPr>
-              <w:t>February 20, 2026</w:t>
+              <w:t>March 6, 2026</w:t>
             </w:r>
             <w:r>
               <w:rPr>
@@ -89,7 +89,7 @@
                 <w:noProof/>
                 <w:webHidden/>
               </w:rPr>
-              <w:instrText xml:space="preserve"> PAGEREF _Toc222493950 \h </w:instrText>
+              <w:instrText xml:space="preserve"> PAGEREF _Toc223700993 \h </w:instrText>
             </w:r>
             <w:r>
               <w:rPr>
@@ -131,7 +131,76 @@
               <w:noProof/>
             </w:rPr>
           </w:pPr>
-          <w:hyperlink w:anchor="_Toc222493951" w:history="1">
+          <w:hyperlink w:anchor="_Toc223700994" w:history="1">
+            <w:r>
+              <w:rPr>
+                <w:rStyle w:val="Hyperlink"/>
+                <w:noProof/>
+              </w:rPr>
+              <w:t>February 20, 2026</w:t>
+            </w:r>
+            <w:r>
+              <w:rPr>
+                <w:noProof/>
+                <w:webHidden/>
+              </w:rPr>
+              <w:tab/>
+            </w:r>
+            <w:r>
+              <w:rPr>
+                <w:noProof/>
+                <w:webHidden/>
+              </w:rPr>
+              <w:fldChar w:fldCharType="begin"/>
+            </w:r>
+            <w:r>
+              <w:rPr>
+                <w:noProof/>
+                <w:webHidden/>
+              </w:rPr>
+              <w:instrText xml:space="preserve"> PAGEREF _Toc223700994 \h </w:instrText>
+            </w:r>
+            <w:r>
+              <w:rPr>
+                <w:noProof/>
+                <w:webHidden/>
+              </w:rPr>
+            </w:r>
+            <w:r>
+              <w:rPr>
+                <w:noProof/>
+                <w:webHidden/>
+              </w:rPr>
+              <w:fldChar w:fldCharType="separate"/>
+            </w:r>
+            <w:r>
+              <w:rPr>
+                <w:noProof/>
+                <w:webHidden/>
+              </w:rPr>
+              <w:t>3</w:t>
+            </w:r>
+            <w:r>
+              <w:rPr>
+                <w:noProof/>
+                <w:webHidden/>
+              </w:rPr>
+              <w:fldChar w:fldCharType="end"/>
+            </w:r>
+          </w:hyperlink>
+        </w:p>
+        <w:p>
+          <w:pPr>
+            <w:pStyle w:val="TOC1"/>
+            <w:tabs>
+              <w:tab w:val="right" w:leader="dot" w:pos="9350"/>
+            </w:tabs>
+            <w:rPr>
+              <w:rFonts w:eastAsiaTheme="minorEastAsia"/>
+              <w:noProof/>
+            </w:rPr>
+          </w:pPr>
+          <w:hyperlink w:anchor="_Toc223700995" w:history="1">
             <w:r>
               <w:rPr>
                 <w:rStyle w:val="Hyperlink"/>
@@ -158,7 +227,7 @@
                 <w:noProof/>
                 <w:webHidden/>
               </w:rPr>
-              <w:instrText xml:space="preserve"> PAGEREF _Toc222493951 \h </w:instrText>
+              <w:instrText xml:space="preserve"> PAGEREF _Toc223700995 \h </w:instrText>
             </w:r>
             <w:r>
               <w:rPr>
@@ -178,7 +247,7 @@
                 <w:noProof/>
                 <w:webHidden/>
               </w:rPr>
-              <w:t>5</w:t>
+              <w:t>6</w:t>
             </w:r>
             <w:r>
               <w:rPr>
@@ -200,7 +269,7 @@
               <w:noProof/>
             </w:rPr>
           </w:pPr>
-          <w:hyperlink w:anchor="_Toc222493952" w:history="1">
+          <w:hyperlink w:anchor="_Toc223700996" w:history="1">
             <w:r>
               <w:rPr>
                 <w:rStyle w:val="Hyperlink"/>
@@ -227,7 +296,7 @@
                 <w:noProof/>
                 <w:webHidden/>
               </w:rPr>
-              <w:instrText xml:space="preserve"> PAGEREF _Toc222493952 \h </w:instrText>
+              <w:instrText xml:space="preserve"> PAGEREF _Toc223700996 \h </w:instrText>
             </w:r>
             <w:r>
               <w:rPr>
@@ -247,7 +316,7 @@
                 <w:noProof/>
                 <w:webHidden/>
               </w:rPr>
-              <w:t>7</w:t>
+              <w:t>8</w:t>
             </w:r>
             <w:r>
               <w:rPr>
@@ -279,12 +348,422 @@
       <w:pPr>
         <w:pStyle w:val="Heading1"/>
       </w:pPr>
-      <w:bookmarkStart w:id="0" w:name="_Toc222493950"/>
+      <w:bookmarkStart w:id="0" w:name="_Toc223700993"/>
+      <w:r>
+        <w:lastRenderedPageBreak/>
+        <w:t>March 6, 2026</w:t>
+      </w:r>
+      <w:bookmarkEnd w:id="0"/>
+    </w:p>
+    <w:p>
+      <w:pPr>
+        <w:rPr>
+          <w:b/>
+          <w:bCs/>
+          <w:sz w:val="32"/>
+          <w:u w:val="single"/>
+        </w:rPr>
+      </w:pPr>
+      <w:r>
+        <w:rPr>
+          <w:b/>
+          <w:bCs/>
+          <w:sz w:val="32"/>
+          <w:u w:val="single"/>
+        </w:rPr>
+        <w:t>Meeting With Robinson Next Wednesday at 6 pm</w:t>
+      </w:r>
+    </w:p>
+    <w:p>
+      <w:r>
+        <w:t>Things we want to have done by then to show Robinson</w:t>
+      </w:r>
+    </w:p>
+    <w:p>
+      <w:sdt>
+        <w:sdtPr>
+          <w:id w:val="-27421376"/>
+          <w14:checkbox>
+            <w14:checked w14:val="1"/>
+            <w14:checkedState w14:val="2612" w14:font="MS Gothic"/>
+            <w14:uncheckedState w14:val="2610" w14:font="MS Gothic"/>
+          </w14:checkbox>
+        </w:sdtPr>
+        <w:sdtContent>
+          <w:r>
+            <w:rPr>
+              <w:rFonts w:ascii="MS Gothic" w:eastAsia="MS Gothic" w:hAnsi="MS Gothic" w:hint="eastAsia"/>
+            </w:rPr>
+            <w:t>☒</w:t>
+          </w:r>
+        </w:sdtContent>
+      </w:sdt>
+      <w:r>
+        <w:t>Big Muff Protoboard</w:t>
+      </w:r>
+    </w:p>
+    <w:p>
+      <w:sdt>
+        <w:sdtPr>
+          <w:id w:val="714628280"/>
+          <w14:checkbox>
+            <w14:checked w14:val="1"/>
+            <w14:checkedState w14:val="2612" w14:font="MS Gothic"/>
+            <w14:uncheckedState w14:val="2610" w14:font="MS Gothic"/>
+          </w14:checkbox>
+        </w:sdtPr>
+        <w:sdtContent>
+          <w:r>
+            <w:rPr>
+              <w:rFonts w:ascii="MS Gothic" w:eastAsia="MS Gothic" w:hAnsi="MS Gothic" w:hint="eastAsia"/>
+            </w:rPr>
+            <w:t>☒</w:t>
+          </w:r>
+        </w:sdtContent>
+      </w:sdt>
+      <w:r>
+        <w:t>Overdrive Protoboard</w:t>
+      </w:r>
+    </w:p>
+    <w:p>
+      <w:sdt>
+        <w:sdtPr>
+          <w:id w:val="923148673"/>
+          <w14:checkbox>
+            <w14:checked w14:val="0"/>
+            <w14:checkedState w14:val="2612" w14:font="MS Gothic"/>
+            <w14:uncheckedState w14:val="2610" w14:font="MS Gothic"/>
+          </w14:checkbox>
+        </w:sdtPr>
+        <w:sdtContent>
+          <w:r>
+            <w:rPr>
+              <w:rFonts w:ascii="MS Gothic" w:eastAsia="MS Gothic" w:hAnsi="MS Gothic" w:hint="eastAsia"/>
+            </w:rPr>
+            <w:t>☐</w:t>
+          </w:r>
+        </w:sdtContent>
+      </w:sdt>
+      <w:r>
+        <w:t>Phase 90 Protoboard</w:t>
+      </w:r>
+    </w:p>
+    <w:p>
+      <w:sdt>
+        <w:sdtPr>
+          <w:id w:val="624129715"/>
+          <w14:checkbox>
+            <w14:checked w14:val="0"/>
+            <w14:checkedState w14:val="2612" w14:font="MS Gothic"/>
+            <w14:uncheckedState w14:val="2610" w14:font="MS Gothic"/>
+          </w14:checkbox>
+        </w:sdtPr>
+        <w:sdtContent>
+          <w:r>
+            <w:rPr>
+              <w:rFonts w:ascii="MS Gothic" w:eastAsia="MS Gothic" w:hAnsi="MS Gothic" w:hint="eastAsia"/>
+            </w:rPr>
+            <w:t>☐</w:t>
+          </w:r>
+        </w:sdtContent>
+      </w:sdt>
+      <w:r>
+        <w:t>Pre-amp Protoboard</w:t>
+      </w:r>
+    </w:p>
+    <w:p>
+      <w:sdt>
+        <w:sdtPr>
+          <w:id w:val="1407583571"/>
+          <w14:checkbox>
+            <w14:checked w14:val="0"/>
+            <w14:checkedState w14:val="2612" w14:font="MS Gothic"/>
+            <w14:uncheckedState w14:val="2610" w14:font="MS Gothic"/>
+          </w14:checkbox>
+        </w:sdtPr>
+        <w:sdtContent>
+          <w:r>
+            <w:rPr>
+              <w:rFonts w:ascii="MS Gothic" w:eastAsia="MS Gothic" w:hAnsi="MS Gothic" w:hint="eastAsia"/>
+            </w:rPr>
+            <w:t>☐</w:t>
+          </w:r>
+        </w:sdtContent>
+      </w:sdt>
+      <w:r>
+        <w:t>Power Stage Protoboard</w:t>
+      </w:r>
+    </w:p>
+    <w:p>
+      <w:sdt>
+        <w:sdtPr>
+          <w:id w:val="158280341"/>
+          <w14:checkbox>
+            <w14:checked w14:val="0"/>
+            <w14:checkedState w14:val="2612" w14:font="MS Gothic"/>
+            <w14:uncheckedState w14:val="2610" w14:font="MS Gothic"/>
+          </w14:checkbox>
+        </w:sdtPr>
+        <w:sdtContent>
+          <w:r>
+            <w:rPr>
+              <w:rFonts w:ascii="MS Gothic" w:eastAsia="MS Gothic" w:hAnsi="MS Gothic" w:hint="eastAsia"/>
+            </w:rPr>
+            <w:t>☐</w:t>
+          </w:r>
+        </w:sdtContent>
+      </w:sdt>
+      <w:r>
+        <w:t>A digital effect or Recording</w:t>
+      </w:r>
+    </w:p>
+    <w:p>
+      <w:r>
+        <w:t>This allows us to demonstrate our full path of the RGA</w:t>
+      </w:r>
+    </w:p>
+    <w:p/>
+    <w:p>
+      <w:pPr>
+        <w:rPr>
+          <w:b/>
+          <w:bCs/>
+          <w:sz w:val="32"/>
+          <w:u w:val="single"/>
+        </w:rPr>
+      </w:pPr>
+      <w:r>
+        <w:rPr>
+          <w:b/>
+          <w:bCs/>
+          <w:sz w:val="32"/>
+          <w:u w:val="single"/>
+        </w:rPr>
+        <w:t>Other Deadlines Coming Up</w:t>
+      </w:r>
+    </w:p>
+    <w:p>
+      <w:r>
+        <w:t>Board schematics and layouts by end of day Saturday:</w:t>
+      </w:r>
+    </w:p>
+    <w:p>
+      <w:pPr>
+        <w:pStyle w:val="ListParagraph"/>
+        <w:numPr>
+          <w:ilvl w:val="0"/>
+          <w:numId w:val="4"/>
+        </w:numPr>
+      </w:pPr>
+      <w:r>
+        <w:t>Big Muff</w:t>
+      </w:r>
+    </w:p>
+    <w:p>
+      <w:pPr>
+        <w:pStyle w:val="ListParagraph"/>
+        <w:numPr>
+          <w:ilvl w:val="0"/>
+          <w:numId w:val="4"/>
+        </w:numPr>
+      </w:pPr>
+      <w:r>
+        <w:t>Overdrive</w:t>
+      </w:r>
+    </w:p>
+    <w:p>
+      <w:pPr>
+        <w:pStyle w:val="ListParagraph"/>
+        <w:numPr>
+          <w:ilvl w:val="0"/>
+          <w:numId w:val="4"/>
+        </w:numPr>
+      </w:pPr>
+      <w:r>
+        <w:t>Phase 90</w:t>
+      </w:r>
+    </w:p>
+    <w:p>
+      <w:pPr>
+        <w:pStyle w:val="ListParagraph"/>
+        <w:numPr>
+          <w:ilvl w:val="0"/>
+          <w:numId w:val="4"/>
+        </w:numPr>
+      </w:pPr>
+      <w:r>
+        <w:t>Pre-Amp</w:t>
+      </w:r>
+    </w:p>
+    <w:p>
+      <w:pPr>
+        <w:pStyle w:val="ListParagraph"/>
+        <w:numPr>
+          <w:ilvl w:val="0"/>
+          <w:numId w:val="4"/>
+        </w:numPr>
+      </w:pPr>
+      <w:r>
+        <w:t>Power Stage</w:t>
+      </w:r>
+    </w:p>
+    <w:p>
+      <w:pPr>
+        <w:pStyle w:val="ListParagraph"/>
+        <w:numPr>
+          <w:ilvl w:val="0"/>
+          <w:numId w:val="4"/>
+        </w:numPr>
+      </w:pPr>
+      <w:r>
+        <w:t>Power Board</w:t>
+      </w:r>
+    </w:p>
+    <w:p>
+      <w:pPr>
+        <w:pStyle w:val="ListParagraph"/>
+        <w:numPr>
+          <w:ilvl w:val="0"/>
+          <w:numId w:val="4"/>
+        </w:numPr>
+      </w:pPr>
+      <w:r>
+        <w:t>Analog Controller</w:t>
+      </w:r>
+    </w:p>
+    <w:p>
+      <w:r>
+        <w:t>This is every board except for digital board which we already ordered. We have a lot of work to do</w:t>
+      </w:r>
+    </w:p>
+    <w:p/>
+    <w:p>
+      <w:r>
+        <w:t>I would like to get these boards ordered by Tuesday at the latest. This gives 3 weeks for them to be made and should be here when we get back from spring Break.</w:t>
+      </w:r>
+    </w:p>
+    <w:p/>
+    <w:p/>
+    <w:p>
+      <w:pPr>
+        <w:rPr>
+          <w:b/>
+          <w:bCs/>
+          <w:sz w:val="32"/>
+          <w:u w:val="single"/>
+        </w:rPr>
+      </w:pPr>
+      <w:r>
+        <w:rPr>
+          <w:b/>
+          <w:bCs/>
+          <w:sz w:val="32"/>
+          <w:u w:val="single"/>
+        </w:rPr>
+        <w:lastRenderedPageBreak/>
+        <w:t>Division of Labor after Board Orders</w:t>
+      </w:r>
+    </w:p>
+    <w:p>
+      <w:r>
+        <w:t>There will be a hardware lull while boards are being made, but we must keep being productive towards the end produce.</w:t>
+      </w:r>
+    </w:p>
+    <w:p>
+      <w:pPr>
+        <w:pStyle w:val="ListParagraph"/>
+        <w:numPr>
+          <w:ilvl w:val="0"/>
+          <w:numId w:val="4"/>
+        </w:numPr>
+      </w:pPr>
+      <w:r>
+        <w:t>Andrew: Continue to work on USB and digital effects</w:t>
+      </w:r>
+    </w:p>
+    <w:p>
+      <w:pPr>
+        <w:pStyle w:val="ListParagraph"/>
+        <w:numPr>
+          <w:ilvl w:val="0"/>
+          <w:numId w:val="4"/>
+        </w:numPr>
+      </w:pPr>
+      <w:r>
+        <w:t>Kyle: Work on code for analog controller</w:t>
+      </w:r>
+    </w:p>
+    <w:p>
+      <w:pPr>
+        <w:pStyle w:val="ListParagraph"/>
+        <w:numPr>
+          <w:ilvl w:val="0"/>
+          <w:numId w:val="4"/>
+        </w:numPr>
+      </w:pPr>
+      <w:r>
+        <w:t>Marco: Create the enclosure</w:t>
+      </w:r>
+    </w:p>
+    <w:p>
+      <w:pPr>
+        <w:pStyle w:val="ListParagraph"/>
+        <w:numPr>
+          <w:ilvl w:val="0"/>
+          <w:numId w:val="4"/>
+        </w:numPr>
+      </w:pPr>
+      <w:r>
+        <w:t xml:space="preserve">Joseph: </w:t>
+      </w:r>
+      <w:r>
+        <w:t>Plan board placements, interface placements, and harnessing</w:t>
+      </w:r>
+    </w:p>
+    <w:p/>
+    <w:p>
+      <w:pPr>
+        <w:rPr>
+          <w:b/>
+          <w:bCs/>
+          <w:sz w:val="32"/>
+          <w:u w:val="single"/>
+        </w:rPr>
+      </w:pPr>
+      <w:r>
+        <w:rPr>
+          <w:b/>
+          <w:bCs/>
+          <w:sz w:val="32"/>
+          <w:u w:val="single"/>
+        </w:rPr>
+        <w:t>Open Mic</w:t>
+      </w:r>
+    </w:p>
+    <w:p/>
+    <w:p>
+      <w:pPr>
+        <w:rPr>
+          <w:rFonts w:asciiTheme="majorHAnsi" w:eastAsiaTheme="majorEastAsia" w:hAnsiTheme="majorHAnsi" w:cstheme="majorBidi"/>
+          <w:color w:val="0F4761" w:themeColor="accent1" w:themeShade="BF"/>
+          <w:sz w:val="40"/>
+          <w:szCs w:val="40"/>
+        </w:rPr>
+      </w:pPr>
+      <w:r>
+        <w:br w:type="page"/>
+      </w:r>
+    </w:p>
+    <w:p>
+      <w:pPr>
+        <w:pStyle w:val="Heading1"/>
+      </w:pPr>
+      <w:bookmarkStart w:id="1" w:name="_Toc223700994"/>
       <w:r>
         <w:lastRenderedPageBreak/>
         <w:t>February 20, 2026</w:t>
       </w:r>
-      <w:bookmarkEnd w:id="0"/>
+      <w:bookmarkEnd w:id="1"/>
     </w:p>
     <w:p>
       <w:pPr>
@@ -1871,12 +2350,12 @@
       <w:pPr>
         <w:pStyle w:val="Heading1"/>
       </w:pPr>
-      <w:bookmarkStart w:id="1" w:name="_Toc222493951"/>
+      <w:bookmarkStart w:id="2" w:name="_Toc223700995"/>
       <w:r>
         <w:lastRenderedPageBreak/>
         <w:t>February 13, 2026</w:t>
       </w:r>
-      <w:bookmarkEnd w:id="1"/>
+      <w:bookmarkEnd w:id="2"/>
     </w:p>
     <w:p>
       <w:pPr>
@@ -2290,12 +2769,12 @@
       <w:pPr>
         <w:pStyle w:val="Heading1"/>
       </w:pPr>
-      <w:bookmarkStart w:id="2" w:name="_Toc222493952"/>
+      <w:bookmarkStart w:id="3" w:name="_Toc223700996"/>
       <w:r>
         <w:lastRenderedPageBreak/>
         <w:t>February 6, 2026</w:t>
       </w:r>
-      <w:bookmarkEnd w:id="2"/>
+      <w:bookmarkEnd w:id="3"/>
     </w:p>
     <w:p>
       <w:pPr>
@@ -2816,6 +3295,118 @@
 <file path=word/numbering.xml><?xml version="1.0" encoding="utf-8"?>
 <w:numbering xmlns:wpc="http://schemas.microsoft.com/office/word/2010/wordprocessingCanvas" xmlns:cx="http://schemas.microsoft.com/office/drawing/2014/chartex" xmlns:cx1="http://schemas.microsoft.com/office/drawing/2015/9/8/chartex" xmlns:cx2="http://schemas.microsoft.com/office/drawing/2015/10/21/chartex" xmlns:cx3="http://schemas.microsoft.com/office/drawing/2016/5/9/chartex" xmlns:cx4="http://schemas.microsoft.com/office/drawing/2016/5/10/chartex" xmlns:cx5="http://schemas.microsoft.com/office/drawing/2016/5/11/chartex" xmlns:cx6="http://schemas.microsoft.com/office/drawing/2016/5/12/chartex" xmlns:cx7="http://schemas.microsoft.com/office/drawing/2016/5/13/chartex" xmlns:cx8="http://schemas.microsoft.com/office/drawing/2016/5/14/chartex" xmlns:mc="http://schemas.openxmlformats.org/markup-compatibility/2006" xmlns:aink="http://schemas.microsoft.com/office/drawing/2016/ink" xmlns:am3d="http://schemas.microsoft.com/office/drawing/2017/model3d" xmlns:o="urn:schemas-microsoft-com:office:office" xmlns:oel="http://schemas.microsoft.com/office/2019/extlst" xmlns:r="http://schemas.openxmlformats.org/officeDocument/2006/relationships" xmlns:m="http://schemas.openxmlformats.org/officeDocument/2006/math" xmlns:v="urn:schemas-microsoft-com:vml" xmlns:wp14="http://schemas.microsoft.com/office/word/2010/wordprocessingDrawing" xmlns:wp="http://schemas.openxmlformats.org/drawingml/2006/wordprocessingDrawing" xmlns:w10="urn:schemas-microsoft-com:office:word" xmlns:w="http://schemas.openxmlformats.org/wordprocessingml/2006/main" xmlns:w14="http://schemas.microsoft.com/office/word/2010/wordml" xmlns:w15="http://schemas.microsoft.com/office/word/2012/wordml" xmlns:w16cex="http://schemas.microsoft.com/office/word/2018/wordml/cex" xmlns:w16cid="http://schemas.microsoft.com/office/word/2016/wordml/cid" xmlns:w16="http://schemas.microsoft.com/office/word/2018/wordml" xmlns:w16du="http://schemas.microsoft.com/office/word/2023/wordml/word16du" xmlns:w16sdtdh="http://schemas.microsoft.com/office/word/2020/wordml/sdtdatahash" xmlns:w16sdtfl="http://schemas.microsoft.com/office/word/2024/wordml/sdtformatlock" xmlns:w16se="http://schemas.microsoft.com/office/word/2015/wordml/symex" xmlns:wpg="http://schemas.microsoft.com/office/word/2010/wordprocessingGroup" xmlns:wpi="http://schemas.microsoft.com/office/word/2010/wordprocessingInk" xmlns:wne="http://schemas.microsoft.com/office/word/2006/wordml" xmlns:wps="http://schemas.microsoft.com/office/word/2010/wordprocessingShape" mc:Ignorable="w14 w15 w16se w16cid w16 w16cex w16sdtdh w16sdtfl w16du wp14">
   <w:abstractNum w:abstractNumId="0" w15:restartNumberingAfterBreak="0">
+    <w:nsid w:val="5CF03CD7"/>
+    <w:multiLevelType w:val="hybridMultilevel"/>
+    <w:tmpl w:val="92A0668A"/>
+    <w:lvl w:ilvl="0" w:tplc="4866CF70">
+      <w:numFmt w:val="bullet"/>
+      <w:lvlText w:val="-"/>
+      <w:lvlJc w:val="left"/>
+      <w:pPr>
+        <w:ind w:left="720" w:hanging="360"/>
+      </w:pPr>
+      <w:rPr>
+        <w:rFonts w:ascii="Aptos" w:eastAsiaTheme="minorHAnsi" w:hAnsi="Aptos" w:cstheme="minorBidi" w:hint="default"/>
+      </w:rPr>
+    </w:lvl>
+    <w:lvl w:ilvl="1" w:tplc="04090003" w:tentative="1">
+      <w:start w:val="1"/>
+      <w:numFmt w:val="bullet"/>
+      <w:lvlText w:val="o"/>
+      <w:lvlJc w:val="left"/>
+      <w:pPr>
+        <w:ind w:left="1440" w:hanging="360"/>
+      </w:pPr>
+      <w:rPr>
+        <w:rFonts w:ascii="Courier New" w:hAnsi="Courier New" w:cs="Courier New" w:hint="default"/>
+      </w:rPr>
+    </w:lvl>
+    <w:lvl w:ilvl="2" w:tplc="04090005" w:tentative="1">
+      <w:start w:val="1"/>
+      <w:numFmt w:val="bullet"/>
+      <w:lvlText w:val=""/>
+      <w:lvlJc w:val="left"/>
+      <w:pPr>
+        <w:ind w:left="2160" w:hanging="360"/>
+      </w:pPr>
+      <w:rPr>
+        <w:rFonts w:ascii="Wingdings" w:hAnsi="Wingdings" w:hint="default"/>
+      </w:rPr>
+    </w:lvl>
+    <w:lvl w:ilvl="3" w:tplc="04090001" w:tentative="1">
+      <w:start w:val="1"/>
+      <w:numFmt w:val="bullet"/>
+      <w:lvlText w:val=""/>
+      <w:lvlJc w:val="left"/>
+      <w:pPr>
+        <w:ind w:left="2880" w:hanging="360"/>
+      </w:pPr>
+      <w:rPr>
+        <w:rFonts w:ascii="Symbol" w:hAnsi="Symbol" w:hint="default"/>
+      </w:rPr>
+    </w:lvl>
+    <w:lvl w:ilvl="4" w:tplc="04090003" w:tentative="1">
+      <w:start w:val="1"/>
+      <w:numFmt w:val="bullet"/>
+      <w:lvlText w:val="o"/>
+      <w:lvlJc w:val="left"/>
+      <w:pPr>
+        <w:ind w:left="3600" w:hanging="360"/>
+      </w:pPr>
+      <w:rPr>
+        <w:rFonts w:ascii="Courier New" w:hAnsi="Courier New" w:cs="Courier New" w:hint="default"/>
+      </w:rPr>
+    </w:lvl>
+    <w:lvl w:ilvl="5" w:tplc="04090005" w:tentative="1">
+      <w:start w:val="1"/>
+      <w:numFmt w:val="bullet"/>
+      <w:lvlText w:val=""/>
+      <w:lvlJc w:val="left"/>
+      <w:pPr>
+        <w:ind w:left="4320" w:hanging="360"/>
+      </w:pPr>
+      <w:rPr>
+        <w:rFonts w:ascii="Wingdings" w:hAnsi="Wingdings" w:hint="default"/>
+      </w:rPr>
+    </w:lvl>
+    <w:lvl w:ilvl="6" w:tplc="04090001" w:tentative="1">
+      <w:start w:val="1"/>
+      <w:numFmt w:val="bullet"/>
+      <w:lvlText w:val=""/>
+      <w:lvlJc w:val="left"/>
+      <w:pPr>
+        <w:ind w:left="5040" w:hanging="360"/>
+      </w:pPr>
+      <w:rPr>
+        <w:rFonts w:ascii="Symbol" w:hAnsi="Symbol" w:hint="default"/>
+      </w:rPr>
+    </w:lvl>
+    <w:lvl w:ilvl="7" w:tplc="04090003" w:tentative="1">
+      <w:start w:val="1"/>
+      <w:numFmt w:val="bullet"/>
+      <w:lvlText w:val="o"/>
+      <w:lvlJc w:val="left"/>
+      <w:pPr>
+        <w:ind w:left="5760" w:hanging="360"/>
+      </w:pPr>
+      <w:rPr>
+        <w:rFonts w:ascii="Courier New" w:hAnsi="Courier New" w:cs="Courier New" w:hint="default"/>
+      </w:rPr>
+    </w:lvl>
+    <w:lvl w:ilvl="8" w:tplc="04090005" w:tentative="1">
+      <w:start w:val="1"/>
+      <w:numFmt w:val="bullet"/>
+      <w:lvlText w:val=""/>
+      <w:lvlJc w:val="left"/>
+      <w:pPr>
+        <w:ind w:left="6480" w:hanging="360"/>
+      </w:pPr>
+      <w:rPr>
+        <w:rFonts w:ascii="Wingdings" w:hAnsi="Wingdings" w:hint="default"/>
+      </w:rPr>
+    </w:lvl>
+  </w:abstractNum>
+  <w:abstractNum w:abstractNumId="1" w15:restartNumberingAfterBreak="0">
     <w:nsid w:val="627865BF"/>
     <w:multiLevelType w:val="hybridMultilevel"/>
     <w:tmpl w:val="E80A7AB6"/>
@@ -2927,7 +3518,7 @@
       </w:rPr>
     </w:lvl>
   </w:abstractNum>
-  <w:abstractNum w:abstractNumId="1" w15:restartNumberingAfterBreak="0">
+  <w:abstractNum w:abstractNumId="2" w15:restartNumberingAfterBreak="0">
     <w:nsid w:val="65B93378"/>
     <w:multiLevelType w:val="hybridMultilevel"/>
     <w:tmpl w:val="ED00BB9C"/>
@@ -3039,11 +3630,129 @@
       </w:rPr>
     </w:lvl>
   </w:abstractNum>
+  <w:abstractNum w:abstractNumId="3" w15:restartNumberingAfterBreak="0">
+    <w:nsid w:val="672E1DD6"/>
+    <w:multiLevelType w:val="hybridMultilevel"/>
+    <w:tmpl w:val="2E2831BE"/>
+    <w:lvl w:ilvl="0" w:tplc="AD4EF540">
+      <w:numFmt w:val="bullet"/>
+      <w:lvlText w:val="-"/>
+      <w:lvlJc w:val="left"/>
+      <w:pPr>
+        <w:ind w:left="720" w:hanging="360"/>
+      </w:pPr>
+      <w:rPr>
+        <w:rFonts w:ascii="Aptos" w:eastAsiaTheme="minorHAnsi" w:hAnsi="Aptos" w:cstheme="minorBidi" w:hint="default"/>
+      </w:rPr>
+    </w:lvl>
+    <w:lvl w:ilvl="1" w:tplc="04090003" w:tentative="1">
+      <w:start w:val="1"/>
+      <w:numFmt w:val="bullet"/>
+      <w:lvlText w:val="o"/>
+      <w:lvlJc w:val="left"/>
+      <w:pPr>
+        <w:ind w:left="1440" w:hanging="360"/>
+      </w:pPr>
+      <w:rPr>
+        <w:rFonts w:ascii="Courier New" w:hAnsi="Courier New" w:cs="Courier New" w:hint="default"/>
+      </w:rPr>
+    </w:lvl>
+    <w:lvl w:ilvl="2" w:tplc="04090005" w:tentative="1">
+      <w:start w:val="1"/>
+      <w:numFmt w:val="bullet"/>
+      <w:lvlText w:val=""/>
+      <w:lvlJc w:val="left"/>
+      <w:pPr>
+        <w:ind w:left="2160" w:hanging="360"/>
+      </w:pPr>
+      <w:rPr>
+        <w:rFonts w:ascii="Wingdings" w:hAnsi="Wingdings" w:hint="default"/>
+      </w:rPr>
+    </w:lvl>
+    <w:lvl w:ilvl="3" w:tplc="04090001" w:tentative="1">
+      <w:start w:val="1"/>
+      <w:numFmt w:val="bullet"/>
+      <w:lvlText w:val=""/>
+      <w:lvlJc w:val="left"/>
+      <w:pPr>
+        <w:ind w:left="2880" w:hanging="360"/>
+      </w:pPr>
+      <w:rPr>
+        <w:rFonts w:ascii="Symbol" w:hAnsi="Symbol" w:hint="default"/>
+      </w:rPr>
+    </w:lvl>
+    <w:lvl w:ilvl="4" w:tplc="04090003" w:tentative="1">
+      <w:start w:val="1"/>
+      <w:numFmt w:val="bullet"/>
+      <w:lvlText w:val="o"/>
+      <w:lvlJc w:val="left"/>
+      <w:pPr>
+        <w:ind w:left="3600" w:hanging="360"/>
+      </w:pPr>
+      <w:rPr>
+        <w:rFonts w:ascii="Courier New" w:hAnsi="Courier New" w:cs="Courier New" w:hint="default"/>
+      </w:rPr>
+    </w:lvl>
+    <w:lvl w:ilvl="5" w:tplc="04090005" w:tentative="1">
+      <w:start w:val="1"/>
+      <w:numFmt w:val="bullet"/>
+      <w:lvlText w:val=""/>
+      <w:lvlJc w:val="left"/>
+      <w:pPr>
+        <w:ind w:left="4320" w:hanging="360"/>
+      </w:pPr>
+      <w:rPr>
+        <w:rFonts w:ascii="Wingdings" w:hAnsi="Wingdings" w:hint="default"/>
+      </w:rPr>
+    </w:lvl>
+    <w:lvl w:ilvl="6" w:tplc="04090001" w:tentative="1">
+      <w:start w:val="1"/>
+      <w:numFmt w:val="bullet"/>
+      <w:lvlText w:val=""/>
+      <w:lvlJc w:val="left"/>
+      <w:pPr>
+        <w:ind w:left="5040" w:hanging="360"/>
+      </w:pPr>
+      <w:rPr>
+        <w:rFonts w:ascii="Symbol" w:hAnsi="Symbol" w:hint="default"/>
+      </w:rPr>
+    </w:lvl>
+    <w:lvl w:ilvl="7" w:tplc="04090003" w:tentative="1">
+      <w:start w:val="1"/>
+      <w:numFmt w:val="bullet"/>
+      <w:lvlText w:val="o"/>
+      <w:lvlJc w:val="left"/>
+      <w:pPr>
+        <w:ind w:left="5760" w:hanging="360"/>
+      </w:pPr>
+      <w:rPr>
+        <w:rFonts w:ascii="Courier New" w:hAnsi="Courier New" w:cs="Courier New" w:hint="default"/>
+      </w:rPr>
+    </w:lvl>
+    <w:lvl w:ilvl="8" w:tplc="04090005" w:tentative="1">
+      <w:start w:val="1"/>
+      <w:numFmt w:val="bullet"/>
+      <w:lvlText w:val=""/>
+      <w:lvlJc w:val="left"/>
+      <w:pPr>
+        <w:ind w:left="6480" w:hanging="360"/>
+      </w:pPr>
+      <w:rPr>
+        <w:rFonts w:ascii="Wingdings" w:hAnsi="Wingdings" w:hint="default"/>
+      </w:rPr>
+    </w:lvl>
+  </w:abstractNum>
   <w:num w:numId="1" w16cid:durableId="1376345720">
+    <w:abstractNumId w:val="1"/>
+  </w:num>
+  <w:num w:numId="2" w16cid:durableId="2108424632">
+    <w:abstractNumId w:val="2"/>
+  </w:num>
+  <w:num w:numId="3" w16cid:durableId="1964266755">
     <w:abstractNumId w:val="0"/>
   </w:num>
-  <w:num w:numId="2" w16cid:durableId="2108424632">
-    <w:abstractNumId w:val="1"/>
+  <w:num w:numId="4" w16cid:durableId="1838567537">
+    <w:abstractNumId w:val="3"/>
   </w:num>
 </w:numbering>
 </file>
@@ -4334,4 +5043,16 @@
     </a:ext>
   </a:extLst>
 </a:theme>
+</file>
+
+<file path=customXml/item1.xml><?xml version="1.0" encoding="utf-8"?>
+<b:Sources xmlns:b="http://schemas.openxmlformats.org/officeDocument/2006/bibliography" xmlns="http://schemas.openxmlformats.org/officeDocument/2006/bibliography" SelectedStyle="\APASixthEditionOfficeOnline.xsl" StyleName="APA" Version="6"/>
+</file>
+
+<file path=customXml/itemProps1.xml><?xml version="1.0" encoding="utf-8"?>
+<ds:datastoreItem xmlns:ds="http://schemas.openxmlformats.org/officeDocument/2006/customXml" ds:itemID="{16E5755B-3E96-478F-9614-7EA720F59AD3}">
+  <ds:schemaRefs>
+    <ds:schemaRef ds:uri="http://schemas.openxmlformats.org/officeDocument/2006/bibliography"/>
+  </ds:schemaRefs>
+</ds:datastoreItem>
 </file>
</xml_diff>